<commit_message>
Fix batch 17 asset record and statutory explanations
</commit_message>
<xml_diff>
--- a/docs/word/Series LLC Owners Manual - REVISED DRAFT.docx
+++ b/docs/word/Series LLC Owners Manual - REVISED DRAFT.docx
@@ -159,7 +159,7 @@
           <w:sz w:val="20"/>
           <w:szCs w:val="20"/>
         </w:rPr>
-        <w:t xml:space="preserve">Written for the Florida Uniform Protected Series Act</w:t>
+        <w:t xml:space="preserve">Written for Florida's Uniform Protected Series Provisions</w:t>
       </w:r>
     </w:p>
     <w:p>
@@ -2232,7 +2232,7 @@
           <w:sz w:val="22"/>
           <w:szCs w:val="22"/>
         </w:rPr>
-        <w:t xml:space="preserve">Your operating agreement fights this battle for you in two ways. Article 8 puts the records in a named person's hands and sets the standard they must meet. And the standing association rules at the end of Article 8 — a provision you will not find in other companies' forms — makes the agreement </w:t>
+        <w:t xml:space="preserve">Your operating agreement fights this battle for you in two ways. Article 8 puts the records in a named person's hands and sets the standard they must meet. The standing association rules in Section 8.5 make the agreement </w:t>
       </w:r>
       <w:r>
         <w:rPr>
@@ -2249,24 +2249,7 @@
           <w:sz w:val="22"/>
           <w:szCs w:val="22"/>
         </w:rPr>
-        <w:t xml:space="preserve"> part of your records: assets titled in a series' name, bought with a series' funds, or held in a series' accounts are associated with that series by standing rule, income and proceeds follow the asset that produced them, and anything left over is associated with the mothership so that </w:t>
-      </w:r>
-      <w:r>
-        <w:rPr>
-          <w:rFonts w:ascii="Georgia" w:hAnsi="Georgia"/>
-          <w:b/>
-          <w:sz w:val="22"/>
-          <w:szCs w:val="22"/>
-        </w:rPr>
-        <w:t xml:space="preserve">no asset of yours is ever "non-associated."</w:t>
-      </w:r>
-      <w:r>
-        <w:rPr>
-          <w:rFonts w:ascii="Georgia" w:hAnsi="Georgia"/>
-          <w:sz w:val="22"/>
-          <w:szCs w:val="22"/>
-        </w:rPr>
-        <w:t xml:space="preserve"> They are a safety net, not a substitute: it works alongside real ledgers and real bank accounts, not instead of them.</w:t>
+        <w:t xml:space="preserve"> part of your records and help determine where assets belong. They work alongside real ledgers and real bank accounts, not instead of them. Missing records can leave an asset non-associated; the default rule does not replace the identifying, acquisition, and transfer information the statute requires.</w:t>
       </w:r>
     </w:p>
     <w:p>
@@ -4844,7 +4827,7 @@
                 <w:sz w:val="20"/>
                 <w:szCs w:val="20"/>
               </w:rPr>
-              <w:t xml:space="preserve">The recordkeeping covenants (this manual's Section 14 is its field guide) and the standing association rules that close the Article — and the titling rule (§8.4): every asset is held in the name of the silo that owns it, never your personal name</w:t>
+              <w:t xml:space="preserve">The recordkeeping covenants (this manual's Section 14 is its field guide) and the standing association rules in Section 8.5 — and the holding rule (§8.4): hold assets in the owning company's or series' name, or through a properly documented nominee arrangement under Section 8.4 — not simply in your personal name</w:t>
             </w:r>
           </w:p>
         </w:tc>
@@ -5410,7 +5393,7 @@
           <w:sz w:val="22"/>
           <w:szCs w:val="22"/>
         </w:rPr>
-        <w:t xml:space="preserve"> An unsigned operating agreement is a rumor. Your agreement also makes itself part of the association records (the standing association rules at the end of Article 8) — it only earns that status executed.</w:t>
+        <w:t xml:space="preserve"> An unsigned operating agreement is a rumor. Your agreement also makes itself part of the association records (the standing association rules in Section 8.5) — it only earns that status executed.</w:t>
       </w:r>
     </w:p>
     <w:p>
@@ -5576,41 +5559,7 @@
           <w:sz w:val="22"/>
           <w:szCs w:val="22"/>
         </w:rPr>
-        <w:t xml:space="preserve"> Any asset you fail to associate with a series lands, by standing rule, in the company's silo. That is deliberately protective — it means a sloppy record never creates a </w:t>
-      </w:r>
-      <w:r>
-        <w:rPr>
-          <w:rFonts w:ascii="Georgia" w:hAnsi="Georgia"/>
-          <w:i/>
-          <w:sz w:val="22"/>
-          <w:szCs w:val="22"/>
-        </w:rPr>
-        <w:t xml:space="preserve">non-associated</w:t>
-      </w:r>
-      <w:r>
-        <w:rPr>
-          <w:rFonts w:ascii="Georgia" w:hAnsi="Georgia"/>
-          <w:sz w:val="22"/>
-          <w:szCs w:val="22"/>
-        </w:rPr>
-        <w:t xml:space="preserve"> free-for-all asset — but it also means </w:t>
-      </w:r>
-      <w:r>
-        <w:rPr>
-          <w:rFonts w:ascii="Georgia" w:hAnsi="Georgia"/>
-          <w:b/>
-          <w:sz w:val="22"/>
-          <w:szCs w:val="22"/>
-        </w:rPr>
-        <w:t xml:space="preserve">sloppiness collects in the mothership</w:t>
-      </w:r>
-      <w:r>
-        <w:rPr>
-          <w:rFonts w:ascii="Georgia" w:hAnsi="Georgia"/>
-          <w:sz w:val="22"/>
-          <w:szCs w:val="22"/>
-        </w:rPr>
-        <w:t xml:space="preserve">. If the mothership is asset-light, a record you missed exposes little.</w:t>
+        <w:t xml:space="preserve"> The standing association rules help determine where assets belong, but they do not replace the required records. Missing records can leave an asset non-associated. Keep the mothership asset-light and document every asset.</w:t>
       </w:r>
     </w:p>
     <w:p>
@@ -6432,7 +6381,7 @@
           <w:sz w:val="22"/>
           <w:szCs w:val="22"/>
         </w:rPr>
-        <w:t xml:space="preserve"> Florida taxes deed transfers (70 cents per $100 of consideration). Transferring </w:t>
+        <w:t xml:space="preserve"> Outside Miami-Dade County, the rate is 70 cents per $100 or fraction of taxable consideration. Miami-Dade charges 60 cents per $100 or fraction, plus a 45-cent surtax unless the document transfers only a single-family dwelling. Transferring </w:t>
       </w:r>
       <w:r>
         <w:rPr>
@@ -6449,7 +6398,7 @@
           <w:sz w:val="22"/>
           <w:szCs w:val="22"/>
         </w:rPr>
-        <w:t xml:space="preserve"> property to your own entity is generally taxed on the mortgage balance, even with no money changing hands. Price this before you transfer — on a $300,000 mortgage that is $2,100. An unencumbered property transferred for no consideration is a different analysis. Confirm the stamp treatment with your closing agent or CPA before recording; do not guess.</w:t>
+        <w:t xml:space="preserve"> property to your own entity can produce taxable consideration even when no cash changes hands. At the 70-cent rate outside Miami-Dade, $300,000 of taxable consideration produces $2,100 in tax. An unencumbered property transferred for no consideration is a different analysis. Confirm the consideration, rate, and any exemption with your closing agent or CPA before recording; do not guess.</w:t>
       </w:r>
     </w:p>
     <w:p>
@@ -7617,7 +7566,7 @@
           <w:sz w:val="22"/>
           <w:szCs w:val="22"/>
         </w:rPr>
-        <w:t xml:space="preserve">Your personal money touches the structure in exactly two ways: documented contributions in, documented distributions out. The company debit card buys nothing personal, ever.</w:t>
+        <w:t xml:space="preserve">Document every transfer between you and the company or a series: contributions, distributions, loans, repayments, and legitimate expense reimbursements. Identify the parties and purpose, and use the correct account. The company debit card buys nothing personal, ever.</w:t>
       </w:r>
     </w:p>
     <w:p>
@@ -11914,7 +11863,7 @@
           <w:sz w:val="22"/>
           <w:szCs w:val="22"/>
         </w:rPr>
-        <w:t xml:space="preserve"> $100 plus every missed year's annual report fee — on top of losing the shields in the interim.</w:t>
+        <w:t xml:space="preserve"> $100 plus every missed year's annual report fee. Administrative dissolution restricts the company to winding up; it does not automatically remove its liability protections. Keep the required records and resolve the lapse promptly.</w:t>
       </w:r>
     </w:p>
     <w:p>
@@ -12147,7 +12096,7 @@
           <w:sz w:val="22"/>
           <w:szCs w:val="22"/>
         </w:rPr>
-        <w:t xml:space="preserve">The conduct that loses these fights, ranked by frequency:</w:t>
+        <w:t xml:space="preserve">Conduct that can undermine the shields:</w:t>
       </w:r>
     </w:p>
     <w:p>

</xml_diff>

<commit_message>
Fix batch 17 revision 2 manual pagination
</commit_message>
<xml_diff>
--- a/docs/word/Series LLC Owners Manual - REVISED DRAFT.docx
+++ b/docs/word/Series LLC Owners Manual - REVISED DRAFT.docx
@@ -6381,24 +6381,7 @@
           <w:sz w:val="22"/>
           <w:szCs w:val="22"/>
         </w:rPr>
-        <w:t xml:space="preserve"> Outside Miami-Dade County, the rate is 70 cents per $100 or fraction of taxable consideration. Miami-Dade charges 60 cents per $100 or fraction, plus a 45-cent surtax unless the document transfers only a single-family dwelling. Transferring </w:t>
-      </w:r>
-      <w:r>
-        <w:rPr>
-          <w:rFonts w:ascii="Georgia" w:hAnsi="Georgia"/>
-          <w:i/>
-          <w:sz w:val="22"/>
-          <w:szCs w:val="22"/>
-        </w:rPr>
-        <w:t xml:space="preserve">mortgaged</w:t>
-      </w:r>
-      <w:r>
-        <w:rPr>
-          <w:rFonts w:ascii="Georgia" w:hAnsi="Georgia"/>
-          <w:sz w:val="22"/>
-          <w:szCs w:val="22"/>
-        </w:rPr>
-        <w:t xml:space="preserve"> property to your own entity can produce taxable consideration even when no cash changes hands. At the 70-cent rate outside Miami-Dade, $300,000 of taxable consideration produces $2,100 in tax. An unencumbered property transferred for no consideration is a different analysis. Confirm the consideration, rate, and any exemption with your closing agent or CPA before recording; do not guess.</w:t>
+        <w:t xml:space="preserve"> Outside Miami-Dade County, the rate is 70 cents per $100 or fraction of taxable consideration. Miami-Dade charges 60 cents per $100 or fraction, plus a 45-cent surtax unless only a single-family dwelling is transferred. Mortgaged-property transfers can be taxable without cash changing hands. At the outside-Miami-Dade rate, $300,000 of taxable consideration means $2,100 in tax. Unencumbered, no-consideration transfers require separate analysis. Confirm consideration, rate and exemptions with your closing agent or CPA before recording.</w:t>
       </w:r>
     </w:p>
     <w:p>

</xml_diff>

<commit_message>
Complete batch 18 revision 2 document output and input fixes
</commit_message>
<xml_diff>
--- a/docs/word/Series LLC Owners Manual - REVISED DRAFT.docx
+++ b/docs/word/Series LLC Owners Manual - REVISED DRAFT.docx
@@ -3371,7 +3371,7 @@
                 <w:sz w:val="20"/>
                 <w:szCs w:val="20"/>
               </w:rPr>
-              <w:t xml:space="preserve">Money or property put into a silo. You fund the company; the company funds each series (s. 6.1 of your agreement). Recorded against the silo that receives it</w:t>
+              <w:t xml:space="preserve">Money or property put into a silo. You fund the company; the company funds each series (Section 6.1 of your agreement). Recorded against the silo that receives it</w:t>
             </w:r>
           </w:p>
         </w:tc>
@@ -5807,7 +5807,7 @@
           <w:sz w:val="22"/>
           <w:szCs w:val="22"/>
         </w:rPr>
-        <w:t xml:space="preserve"> Get the name right and the record makes itself; get it wrong and you are proving association the hard way, out of ledgers, with the burden on you (§605.2404(4)). So the practice below is a strong recommendation, not a statutory command:</w:t>
+        <w:t xml:space="preserve"> Get the name right and the record makes itself; get it wrong and you are proving association the hard way, out of ledgers, with the burden on you (s. 605.2404(4)). So the practice below is a strong recommendation, not a statutory command:</w:t>
       </w:r>
     </w:p>
     <w:p>
@@ -5906,7 +5906,7 @@
           <w:sz w:val="22"/>
           <w:szCs w:val="22"/>
         </w:rPr>
-        <w:t xml:space="preserve"> Under §605.2301(5), a protected series may </w:t>
+        <w:t xml:space="preserve"> Under s. 605.2301(5), a protected series may </w:t>
       </w:r>
       <w:r>
         <w:rPr>
@@ -6127,7 +6127,7 @@
           <w:sz w:val="22"/>
           <w:szCs w:val="22"/>
         </w:rPr>
-        <w:t xml:space="preserve">, deposited to that silo's account, and recorded (Article 6; the Series Exhibit's contribution line). The record answers §605.2301's second question — when and from whom the asset came.</w:t>
+        <w:t xml:space="preserve">, deposited to that silo's account, and recorded (Article 6; the Series Exhibit's contribution line). The record answers s. 605.2301's second question — when and from whom the asset came.</w:t>
       </w:r>
     </w:p>
     <w:p>
@@ -7926,7 +7926,7 @@
           <w:sz w:val="22"/>
           <w:szCs w:val="22"/>
         </w:rPr>
-        <w:t xml:space="preserve"> legal description for real estate; institution/title/last-four for accounts; year-make-model-VIN for vehicles; serial numbers for equipment; parties-and-date for contracts. Plus: date acquired, from whom, and — if acquired from another silo — consideration, payor, payee. This is the record §605.2301 names first, and the first thing to update after any acquisition. </w:t>
+        <w:t xml:space="preserve"> legal description for real estate; institution/title/last-four for accounts; year-make-model-VIN for vehicles; serial numbers for equipment; parties-and-date for contracts. Plus: date acquired, from whom, and — if acquired from another silo — consideration, payor, payee. This is the record s. 605.2301 names first, and the first thing to update after any acquisition. </w:t>
       </w:r>
       <w:r>
         <w:rPr>
@@ -8182,7 +8182,7 @@
           <w:sz w:val="22"/>
           <w:szCs w:val="22"/>
         </w:rPr>
-        <w:t xml:space="preserve"> — Article 8's correction provision makes correcting records a duty, and corrections made before a claim arises are worth incomparably more than corrections after (remember §605.2404 lets a creditor test association as of the date a liability was incurred, so a fix made after a claim exists comes too late for that claim).</w:t>
+        <w:t xml:space="preserve"> — Article 8's correction provision makes correcting records a duty, and corrections made before a claim arises are worth incomparably more than corrections after (remember s. 605.2404 lets a creditor test association as of the date a liability was incurred, so a fix made after a claim exists comes too late for that claim).</w:t>
       </w:r>
     </w:p>
     <w:p>
@@ -13110,22 +13110,22 @@
           <w:sz w:val="22"/>
           <w:szCs w:val="22"/>
         </w:rPr>
-        <w:t xml:space="preserve"> Sign in, download, and get the papers to your attorney the same day. A default judgment converts a defensible claim into a fixed debt of that series — and tests your records under §605.2404 at their worst moment. The alert email is not the last step; it is the first.</w:t>
-      </w:r>
-    </w:p>
-    <w:p>
-      <w:pPr>
-        <w:widowControl/>
-        <w:spacing w:after="160"/>
-        <w:jc w:val="both"/>
-      </w:pPr>
-      <w:r>
-        <w:rPr>
-          <w:rFonts w:ascii="Georgia" w:hAnsi="Georgia"/>
-          <w:sz w:val="22"/>
-          <w:szCs w:val="22"/>
-        </w:rPr>
-        <w:t xml:space="preserve">Housekeeping that keeps service working: keep your email address current in the portal (your operating agreement and our terms both require current contact information), and keep the registered agent service paid — an agent's resignation for nonpayment leaves every silo exposed to service you will never see.</w:t>
+        <w:t xml:space="preserve"> Sign in, download, and get the papers to your attorney the same day. A default judgment converts a defensible claim into a fixed debt of that series — and tests your records under s. 605.2404 at their worst moment. The alert email is not the last step; it is the first.</w:t>
+      </w:r>
+    </w:p>
+    <w:p>
+      <w:pPr>
+        <w:widowControl/>
+        <w:spacing w:after="160"/>
+        <w:jc w:val="both"/>
+      </w:pPr>
+      <w:r>
+        <w:rPr>
+          <w:rFonts w:ascii="Georgia" w:hAnsi="Georgia"/>
+          <w:sz w:val="22"/>
+          <w:szCs w:val="22"/>
+        </w:rPr>
+        <w:t xml:space="preserve">Housekeeping that keeps service working: keep your email address current in the portal so notices reach you, and keep the registered agent service paid — an agent's resignation for nonpayment leaves every silo exposed to service you will never see.</w:t>
       </w:r>
     </w:p>
     <w:p>
@@ -13779,7 +13779,7 @@
           <w:sz w:val="22"/>
           <w:szCs w:val="22"/>
         </w:rPr>
-        <w:t xml:space="preserve"> Each move restarts the asset's association from scratch, with the burden of proof on you under §605.2404 — and an undocumented move, with no consideration, payor, or payee, leaves nothing to carry that burden with. Acquire in the right silo and leave it there (Section 10).</w:t>
+        <w:t xml:space="preserve"> Each move restarts the asset's association from scratch, with the burden of proof on you under s. 605.2404 — and an undocumented move, with no consideration, payor, or payee, leaves nothing to carry that burden with. Acquire in the right silo and leave it there (Section 10).</w:t>
       </w:r>
     </w:p>
     <w:p>
@@ -17096,7 +17096,7 @@
           <w:sz w:val="22"/>
           <w:szCs w:val="22"/>
         </w:rPr>
-        <w:t xml:space="preserve">© 2026 MyFloridaSeriesLLC. This manual may be updated as Florida law and federal rules evolve; the portal always holds the current edition. Statutory citations verified against Official Florida Statutes: ss. 48.062, 605.0503, 605.2101–605.2802 (including 605.2201, 605.2202, 605.2301, 605.2401, 605.2404, 605.2602, 605.2605–605.2607), 711.50–711.512; Ch. 726; Prop. Treas. Reg. §301.7701-1(a)(5); FinCEN interim final rule (Mar. 2025); Florida Division of Corporations series LLC filing guidance.</w:t>
+        <w:t xml:space="preserve">© 2026 MyFloridaSeriesLLC. This manual may be updated as Florida law and federal rules evolve; the portal always holds the current edition. Statutory citations verified against Official Florida Statutes: ss. 48.062, 220.02, 605.0302, 605.0410, 605.0503, 605.0602, 605.0714, 605.1103, 605.04074, 605.2101–605.2802, 711.50–711.512; former s. 212.031 (historical commercial-rent tax); Ch. 726; Prop. Treas. Reg. §301.7701-1(a)(5); FinCEN interim final rule (Mar. 2025); Florida Division of Corporations series LLC filing guidance.</w:t>
       </w:r>
     </w:p>
     <w:sectPr>

</xml_diff>

<commit_message>
Implement Group D manual clarification and renewal reminder billing policy
</commit_message>
<xml_diff>
--- a/docs/word/Series LLC Owners Manual - REVISED DRAFT.docx
+++ b/docs/word/Series LLC Owners Manual - REVISED DRAFT.docx
@@ -6948,6 +6948,21 @@
     </w:p>
     <w:p>
       <w:pPr>
+        <w:widowControl/>
+        <w:spacing w:after="160"/>
+        <w:jc w:val="both"/>
+      </w:pPr>
+      <w:r>
+        <w:rPr>
+          <w:rFonts w:ascii="Georgia" w:hAnsi="Georgia"/>
+          <w:sz w:val="22"/>
+          <w:szCs w:val="22"/>
+        </w:rPr>
+        <w:t xml:space="preserve">If you choose to file a statement of authority, identify the entity that holds the property. A statement concerning property held by the company identifies the company; a statement concerning property held by a protected series identifies that protected series. The company-form instructions below should not be used for a series filing without confirming the Division’s filing requirements for that series.</w:t>
+      </w:r>
+    </w:p>
+    <w:p>
+      <w:pPr>
         <w:keepNext/>
         <w:widowControl/>
         <w:spacing w:after="160"/>
@@ -6959,7 +6974,7 @@
           <w:sz w:val="22"/>
           <w:szCs w:val="22"/>
         </w:rPr>
-        <w:t xml:space="preserve">If you decide to file, four steps:</w:t>
+        <w:t xml:space="preserve">For a company filing, four steps:</w:t>
       </w:r>
     </w:p>
     <w:tbl>

</xml_diff>

<commit_message>
Reject Group D revision 4 and restore its prior product state
</commit_message>
<xml_diff>
--- a/docs/word/Series LLC Owners Manual - REVISED DRAFT.docx
+++ b/docs/word/Series LLC Owners Manual - REVISED DRAFT.docx
@@ -6948,21 +6948,6 @@
     </w:p>
     <w:p>
       <w:pPr>
-        <w:widowControl/>
-        <w:spacing w:after="160"/>
-        <w:jc w:val="both"/>
-      </w:pPr>
-      <w:r>
-        <w:rPr>
-          <w:rFonts w:ascii="Georgia" w:hAnsi="Georgia"/>
-          <w:sz w:val="22"/>
-          <w:szCs w:val="22"/>
-        </w:rPr>
-        <w:t xml:space="preserve">If you choose to file a statement of authority, identify the entity that holds the property. A statement concerning property held by the company identifies the company; a statement concerning property held by a protected series identifies that protected series. The company-form instructions below should not be used for a series filing without confirming the Division’s filing requirements for that series.</w:t>
-      </w:r>
-    </w:p>
-    <w:p>
-      <w:pPr>
         <w:keepNext/>
         <w:widowControl/>
         <w:spacing w:after="160"/>
@@ -6974,7 +6959,7 @@
           <w:sz w:val="22"/>
           <w:szCs w:val="22"/>
         </w:rPr>
-        <w:t xml:space="preserve">For a company filing, four steps:</w:t>
+        <w:t xml:space="preserve">If you decide to file, four steps:</w:t>
       </w:r>
     </w:p>
     <w:tbl>

</xml_diff>

<commit_message>
Implement Group D revision 5 with matching browser billing assertion
</commit_message>
<xml_diff>
--- a/docs/word/Series LLC Owners Manual - REVISED DRAFT.docx
+++ b/docs/word/Series LLC Owners Manual - REVISED DRAFT.docx
@@ -6948,6 +6948,21 @@
     </w:p>
     <w:p>
       <w:pPr>
+        <w:widowControl/>
+        <w:spacing w:after="160"/>
+        <w:jc w:val="both"/>
+      </w:pPr>
+      <w:r>
+        <w:rPr>
+          <w:rFonts w:ascii="Georgia" w:hAnsi="Georgia"/>
+          <w:sz w:val="22"/>
+          <w:szCs w:val="22"/>
+        </w:rPr>
+        <w:t xml:space="preserve">If you choose to file a statement of authority, identify the entity that holds the property. A statement concerning property held by the company identifies the company; a statement concerning property held by a protected series identifies that protected series. The company-form instructions below should not be used for a series filing without confirming the Division’s filing requirements for that series.</w:t>
+      </w:r>
+    </w:p>
+    <w:p>
+      <w:pPr>
         <w:keepNext/>
         <w:widowControl/>
         <w:spacing w:after="160"/>
@@ -6959,7 +6974,7 @@
           <w:sz w:val="22"/>
           <w:szCs w:val="22"/>
         </w:rPr>
-        <w:t xml:space="preserve">If you decide to file, four steps:</w:t>
+        <w:t xml:space="preserve">For a company filing, four steps:</w:t>
       </w:r>
     </w:p>
     <w:tbl>

</xml_diff>

<commit_message>
Reject Group D revision 5 pending exact Manual declaration
</commit_message>
<xml_diff>
--- a/docs/word/Series LLC Owners Manual - REVISED DRAFT.docx
+++ b/docs/word/Series LLC Owners Manual - REVISED DRAFT.docx
@@ -6948,21 +6948,6 @@
     </w:p>
     <w:p>
       <w:pPr>
-        <w:widowControl/>
-        <w:spacing w:after="160"/>
-        <w:jc w:val="both"/>
-      </w:pPr>
-      <w:r>
-        <w:rPr>
-          <w:rFonts w:ascii="Georgia" w:hAnsi="Georgia"/>
-          <w:sz w:val="22"/>
-          <w:szCs w:val="22"/>
-        </w:rPr>
-        <w:t xml:space="preserve">If you choose to file a statement of authority, identify the entity that holds the property. A statement concerning property held by the company identifies the company; a statement concerning property held by a protected series identifies that protected series. The company-form instructions below should not be used for a series filing without confirming the Division’s filing requirements for that series.</w:t>
-      </w:r>
-    </w:p>
-    <w:p>
-      <w:pPr>
         <w:keepNext/>
         <w:widowControl/>
         <w:spacing w:after="160"/>
@@ -6974,7 +6959,7 @@
           <w:sz w:val="22"/>
           <w:szCs w:val="22"/>
         </w:rPr>
-        <w:t xml:space="preserve">For a company filing, four steps:</w:t>
+        <w:t xml:space="preserve">If you decide to file, four steps:</w:t>
       </w:r>
     </w:p>
     <w:tbl>

</xml_diff>

<commit_message>
Complete Group D with exact Manual replacement declaration
</commit_message>
<xml_diff>
--- a/docs/word/Series LLC Owners Manual - REVISED DRAFT.docx
+++ b/docs/word/Series LLC Owners Manual - REVISED DRAFT.docx
@@ -6948,6 +6948,21 @@
     </w:p>
     <w:p>
       <w:pPr>
+        <w:widowControl/>
+        <w:spacing w:after="160"/>
+        <w:jc w:val="both"/>
+      </w:pPr>
+      <w:r>
+        <w:rPr>
+          <w:rFonts w:ascii="Georgia" w:hAnsi="Georgia"/>
+          <w:sz w:val="22"/>
+          <w:szCs w:val="22"/>
+        </w:rPr>
+        <w:t xml:space="preserve">If you choose to file a statement of authority, identify the entity that holds the property. A statement concerning property held by the company identifies the company; a statement concerning property held by a protected series identifies that protected series. The company-form instructions below should not be used for a series filing without confirming the Division’s filing requirements for that series.</w:t>
+      </w:r>
+    </w:p>
+    <w:p>
+      <w:pPr>
         <w:keepNext/>
         <w:widowControl/>
         <w:spacing w:after="160"/>
@@ -6959,7 +6974,7 @@
           <w:sz w:val="22"/>
           <w:szCs w:val="22"/>
         </w:rPr>
-        <w:t xml:space="preserve">If you decide to file, four steps:</w:t>
+        <w:t xml:space="preserve">For a company filing, four steps:</w:t>
       </w:r>
     </w:p>
     <w:tbl>

</xml_diff>

<commit_message>
Repair approved billing recovery office and Manual findings
</commit_message>
<xml_diff>
--- a/docs/word/Series LLC Owners Manual - REVISED DRAFT.docx
+++ b/docs/word/Series LLC Owners Manual - REVISED DRAFT.docx
@@ -7324,7 +7324,7 @@
                 <w:sz w:val="20"/>
                 <w:szCs w:val="20"/>
               </w:rPr>
-              <w:t xml:space="preserve">every county where the company or a series owns real property.</w:t>
+              <w:t xml:space="preserve">every county where the company owns real property.</w:t>
             </w:r>
             <w:r>
               <w:rPr>
@@ -7710,6 +7710,7 @@
     </w:p>
     <w:p>
       <w:pPr>
+        <w:keepNext/>
         <w:keepLines/>
         <w:widowControl/>
         <w:spacing w:after="80"/>
@@ -7726,6 +7727,7 @@
     </w:p>
     <w:p>
       <w:pPr>
+        <w:keepNext/>
         <w:keepLines/>
         <w:widowControl/>
         <w:spacing w:after="80"/>

</xml_diff>